<commit_message>
Fix three placeholder refs in paper draft
[1] HFBTHO v3.00 — Navarro Perez et al., Comput. Phys. Commun. 220
    (2017) 363-375 (paper III in the HFBTHO series; matches the
    "Copyright 2017, R. Navarro Perez, N. Schunck, ..." header in
    hfbtho/*.f90). Previous draft incorrectly cited HFODD v2.73y, a
    different code from the same group.
[3] Nilsson 1969 — full author list and pagination filled in for the
    foundational Nucl. Phys. A 131 paper on superheavy stability.
[13] HFB-9 — corrected to Goriely, Pearson, Tondeur, ADNDT 77 (2001)
    311-381 (the global HFB mass-table paper that defines the HFB-N
    series).

No other text changed; in-text citations [1], [3], [13] were already
consistent with the new entries.

Co-Authored-By: Claude Opus 4.7 (1M context) <noreply@anthropic.com>
</commit_message>
<xml_diff>
--- a/docs/NucleusGrid_Paper_Draft.docx
+++ b/docs/NucleusGrid_Paper_Draft.docx
@@ -4842,7 +4842,7 @@
         <w:ind w:left="432" w:hanging="432"/>
       </w:pPr>
       <w:r>
-        <w:t>[1] N. Schunck, J. Dobaczewski, W. Satuła, P. Bączyk, J. Dudek, Y. Gao, M. Konieczka, K. Sato, Y. Shi, X.B. Wang, T.R. Werner, “Solution of the Skyrme-Hartree-Fock-Bogolyubov equations in the Cartesian deformed harmonic-oscillator basis. (VIII) HFODD (v2.73y): a new version of the program,” Comput. Phys. Commun. 216 (2017) 145–174.</w:t>
+        <w:t>[1] R. Navarro Perez, N. Schunck, R.-D. Lasseri, C. Zhang, J. Sarich, “Axially deformed solution of the Skyrme-Hartree-Fock-Bogoliubov equations using the transformed harmonic oscillator basis (III) HFBTHO (v3.00): A new version of the program,” Comput. Phys. Commun. 220 (2017) 363–375.</w:t>
       </w:r>
     </w:p>
     <w:p>
@@ -4858,7 +4858,7 @@
         <w:ind w:left="432" w:hanging="432"/>
       </w:pPr>
       <w:r>
-        <w:t>[3] S.G. Nilsson et al., Nucl. Phys. A 131 (1969) 1.   [REF NEEDED — verify]</w:t>
+        <w:t>[3] S.G. Nilsson, C.F. Tsang, A. Sobiczewski, Z. Szymański, S. Wycech, C. Gustafson, I.-L. Lamm, P. Möller, B. Nilsson, “On the nuclear structure and stability of heavy and superheavy elements,” Nucl. Phys. A 131 (1969) 1–66.</w:t>
       </w:r>
     </w:p>
     <w:p>
@@ -4938,7 +4938,7 @@
         <w:ind w:left="432" w:hanging="432"/>
       </w:pPr>
       <w:r>
-        <w:t>[13] S. Goriely, M. Samyn, J.M. Pearson, “Further explorations of Skyrme-Hartree-Fock-Bogoliubov mass formulas. VIII. Role of the effective mass in pairing,” Nucl. Phys. A 750 (2005) 425–443. [HFB-9 family — verify exact reference]   [REF NEEDED — verify]</w:t>
+        <w:t>[13] S. Goriely, J.M. Pearson, F. Tondeur, “Hartree-Fock-Bogoliubov nuclear mass formula,” Atomic Data and Nuclear Data Tables 77 (2001) 311–381. [HFB-9]</w:t>
       </w:r>
     </w:p>
     <w:p>

</xml_diff>

<commit_message>
Add Acknowledgments section to paper draft (between Conclusions and References)
Credits the open-source nuclear physics community for HFBTHO, TALYS,
and KEWPIE2; notes the consumer-hardware (5950X + 3800X) NucleusGrid
distributed setup; and points readers to the public repository.

Co-Authored-By: Claude Opus 4.7 (1M context) <noreply@anthropic.com>
</commit_message>
<xml_diff>
--- a/docs/NucleusGrid_Paper_Draft.docx
+++ b/docs/NucleusGrid_Paper_Draft.docx
@@ -4827,6 +4827,23 @@
           <w:i w:val="0"/>
         </w:rPr>
         <w:t>We have presented a multi-Skyrme, multi-deformation HFBTHO v3.00 [1] survey of the Mc, Nh, and Ts isotope chains across the predicted superheavy stability island, comprising 1,512 self-consistent calculations under four functionals (UNE1, SLY4, SKM*, HFB9), with Bayesian model averaging calibrated against AME2020 [2]. Three principal findings emerge: (i) an oblate ground state at β₂ ≈ −0.07 is established for the N = 179 isotopes Mc-294 and Nh-292 across all four functionals; (ii) the application of an explicit β₂ sweep reduces the cohort Q_α RMSE by approximately 7× relative to the spherical-basis treatment, removing the systematic +1.4 MeV bias and rebalancing the functional weights from a single dominant to near-parity assignment; and (iii) the Mc-299 → Db-279 α-decay chain — initiated from the N = 184 magic parent — terminates at Bh and Db endpoints with deformation-corrected, weighted half-lives reaching the millennial scale, suggesting an experimental signature of the N = 184 region accessible through chemical-isolation methods independent of the prompt α-correlation chain. The Ts deformation extension is reserved as the principal follow-up.</w:t>
+      </w:r>
+    </w:p>
+    <w:p>
+      <w:pPr>
+        <w:pStyle w:val="Heading1"/>
+      </w:pPr>
+      <w:r>
+        <w:t>Acknowledgments</w:t>
+      </w:r>
+    </w:p>
+    <w:p>
+      <w:r>
+        <w:rPr>
+          <w:b w:val="0"/>
+          <w:i w:val="0"/>
+        </w:rPr>
+        <w:t>The author thanks the open-source nuclear physics community for HFBTHO, TALYS, and KEWPIE2. Calculations were performed on consumer hardware (AMD Ryzen 9 5950X and AMD Ryzen 7 3800X) using the NucleusGrid distributed framework. All data, scripts, and results are publicly available at https://github.com/DesilatorRx/nucleusgrid.</w:t>
       </w:r>
     </w:p>
     <w:p>

</xml_diff>